<commit_message>
feat(rondes): aligner demande/validite, type a choisir et exports Word.
La date de demande reste inferieure ou egale a la validite Du, le type de ronde n'est plus fige sur Ouverture, et la date de cloture n'exporte l'heure que pour ouverture/fermeture/accompagnement. Gardiennage, main courante et modeles suivent le meme lot.

Co-authored-by: Cursor <cursoragent@cursor.com>
</commit_message>
<xml_diff>
--- a/public/templates/main-courante-template.docx
+++ b/public/templates/main-courante-template.docx
@@ -21,6 +21,9 @@
         <w:gridCol w:w="5228"/>
       </w:tblGrid>
       <w:tr>
+        <w:trPr>
+          <w:trHeight w:val="293"/>
+        </w:trPr>
         <w:tc>
           <w:tcPr>
             <w:tcW w:w="5228" w:type="dxa"/>
@@ -76,6 +79,9 @@
         </w:tc>
       </w:tr>
       <w:tr>
+        <w:trPr>
+          <w:trHeight w:val="293"/>
+        </w:trPr>
         <w:tc>
           <w:tcPr>
             <w:tcW w:w="10456" w:type="dxa"/>
@@ -103,6 +109,9 @@
         </w:tc>
       </w:tr>
       <w:tr>
+        <w:trPr>
+          <w:trHeight w:val="293"/>
+        </w:trPr>
         <w:tc>
           <w:tcPr>
             <w:tcW w:w="5228" w:type="dxa"/>
@@ -157,11 +166,9 @@
             <w:r>
               <w:t>{</w:t>
             </w:r>
-            <w:proofErr w:type="spellStart"/>
-            <w:r>
-              <w:t>etat</w:t>
-            </w:r>
-            <w:proofErr w:type="spellEnd"/>
+            <w:r>
+              <w:t>statut</w:t>
+            </w:r>
             <w:r>
               <w:t>}</w:t>
             </w:r>
@@ -169,6 +176,9 @@
         </w:tc>
       </w:tr>
       <w:tr>
+        <w:trPr>
+          <w:trHeight w:val="293"/>
+        </w:trPr>
         <w:tc>
           <w:tcPr>
             <w:tcW w:w="5228" w:type="dxa"/>
@@ -224,6 +234,9 @@
         </w:tc>
       </w:tr>
       <w:tr>
+        <w:trPr>
+          <w:trHeight w:val="293"/>
+        </w:trPr>
         <w:tc>
           <w:tcPr>
             <w:tcW w:w="5228" w:type="dxa"/>
@@ -494,16 +507,63 @@
             <w:rPr>
               <w:b/>
               <w:bCs/>
+              <w:sz w:val="36"/>
+              <w:szCs w:val="36"/>
             </w:rPr>
           </w:pPr>
           <w:r>
             <w:rPr>
               <w:b/>
               <w:bCs/>
-              <w:sz w:val="40"/>
-              <w:szCs w:val="40"/>
+              <w:sz w:val="36"/>
+              <w:szCs w:val="36"/>
             </w:rPr>
             <w:t>Main courante</w:t>
+          </w:r>
+          <w:r>
+            <w:rPr>
+              <w:b/>
+              <w:bCs/>
+              <w:sz w:val="36"/>
+              <w:szCs w:val="36"/>
+            </w:rPr>
+            <w:t xml:space="preserve"> N°</w:t>
+          </w:r>
+          <w:r>
+            <w:rPr>
+              <w:sz w:val="36"/>
+              <w:szCs w:val="36"/>
+            </w:rPr>
+            <w:t xml:space="preserve"> </w:t>
+          </w:r>
+          <w:r>
+            <w:rPr>
+              <w:b/>
+              <w:bCs/>
+              <w:sz w:val="36"/>
+              <w:szCs w:val="36"/>
+            </w:rPr>
+            <w:t>{</w:t>
+          </w:r>
+          <w:proofErr w:type="spellStart"/>
+          <w:r>
+            <w:rPr>
+              <w:b/>
+              <w:bCs/>
+              <w:sz w:val="36"/>
+              <w:szCs w:val="36"/>
+            </w:rPr>
+            <w:t>numeroFiche</w:t>
+          </w:r>
+          <w:proofErr w:type="spellEnd"/>
+          <w:r>
+            <w:rPr>
+              <w:b/>
+              <w:bCs/>
+              <w:sz w:val="36"/>
+              <w:szCs w:val="36"/>
+            </w:rPr>
+            <w:t>}</w:t>
           </w:r>
         </w:p>
       </w:tc>
@@ -1277,6 +1337,7 @@
   <w:style w:type="character" w:default="1" w:styleId="Policepardfaut">
     <w:name w:val="Default Paragraph Font"/>
     <w:uiPriority w:val="1"/>
+    <w:semiHidden/>
     <w:unhideWhenUsed/>
   </w:style>
   <w:style w:type="table" w:default="1" w:styleId="TableauNormal">

</xml_diff>